<commit_message>
fix(templates): the fire-safety layout review: the first aid of the IPSU and of decision 7 set like the rest, with only the article label bold, superscripts as superscript digits, dash lists hung from their dash with the room after the list, decision 2's lists nested alike under every training and its two stray slashes gone, bullets in Arial, the training themes' chapters running on without forced pages, room above the tests' answer sheet and under the means list's last table, the posted sheet's first title as high as the next, and the acknowledgement closer to the signature
</commit_message>
<xml_diff>
--- a/packages/document-engine/templates/fire/1.2_fire_decision_training.docx
+++ b/packages/document-engine/templates/fire/1.2_fire_decision_training.docx
@@ -1183,6 +1183,9 @@
           <w:ilvl w:val="2"/>
           <w:numId w:val="21"/>
         </w:numPr>
+        <w:tabs>
+          <w:tab w:val="clear" w:pos="916"/>
+        </w:tabs>
         <w:spacing w:before="0" w:after="40"/>
         <w:jc w:val="left"/>
         <w:rPr>
@@ -1212,7 +1215,10 @@
           <w:ilvl w:val="2"/>
           <w:numId w:val="21"/>
         </w:numPr>
-        <w:spacing w:before="0" w:after="120"/>
+        <w:tabs>
+          <w:tab w:val="clear" w:pos="916"/>
+        </w:tabs>
+        <w:spacing w:before="0" w:after="40"/>
         <w:jc w:val="left"/>
         <w:rPr>
           <w:rFonts w:ascii="Arial" w:hAnsi="Arial" w:cs="Arial"/>
@@ -1365,6 +1371,9 @@
           <w:ilvl w:val="0"/>
           <w:numId w:val="19"/>
         </w:numPr>
+        <w:tabs>
+          <w:tab w:val="clear" w:pos="916"/>
+        </w:tabs>
         <w:spacing w:before="0" w:after="40"/>
         <w:jc w:val="left"/>
         <w:rPr>
@@ -1627,7 +1636,7 @@
           <w:szCs w:val="20"/>
           <w:lang w:val="ro-RO"/>
         </w:rPr>
-        <w:t>acționarea cu mijloace inițiale de combatere a incendiului (stingătoare, hidranți, instalații/ speciale) din dotarea spațiilor afectate;</w:t>
+        <w:t>acționarea cu mijloace inițiale de combatere a incendiului (stingătoare, hidranți, instalații speciale) din dotarea spațiilor afectate;</w:t>
       </w:r>
     </w:p>
     <w:p>
@@ -1657,7 +1666,7 @@
           <w:szCs w:val="20"/>
           <w:lang w:val="ro-RO"/>
         </w:rPr>
-        <w:t>se va avea o atenție sporită în cazul acțiunilor efectuate simultan (ex.: evacuare persoane și intervenție folosind mijloacele de / primă intervenție), ordinea înscrisă este cea a priorităților.</w:t>
+        <w:t>se va avea o atenție sporită în cazul acțiunilor efectuate simultan (ex.: evacuare persoane și intervenție folosind mijloacele de primă intervenție), ordinea înscrisă este cea a priorităților.</w:t>
       </w:r>
     </w:p>
     <w:p>
@@ -1668,6 +1677,9 @@
           <w:ilvl w:val="0"/>
           <w:numId w:val="19"/>
         </w:numPr>
+        <w:tabs>
+          <w:tab w:val="clear" w:pos="916"/>
+        </w:tabs>
         <w:spacing w:before="0" w:after="40"/>
         <w:jc w:val="left"/>
         <w:rPr>
@@ -1736,7 +1748,7 @@
         <w:widowControl/>
         <w:numPr>
           <w:ilvl w:val="1"/>
-          <w:numId w:val="8"/>
+          <w:numId w:val="23"/>
         </w:numPr>
         <w:tabs>
           <w:tab w:val="clear" w:pos="916"/>
@@ -1768,12 +1780,12 @@
         <w:widowControl/>
         <w:numPr>
           <w:ilvl w:val="1"/>
-          <w:numId w:val="8"/>
+          <w:numId w:val="23"/>
         </w:numPr>
         <w:tabs>
           <w:tab w:val="clear" w:pos="916"/>
         </w:tabs>
-        <w:spacing w:before="0" w:after="120"/>
+        <w:spacing w:before="0" w:after="40"/>
         <w:jc w:val="left"/>
         <w:rPr>
           <w:rFonts w:ascii="Arial" w:hAnsi="Arial" w:cs="Arial"/>
@@ -1926,6 +1938,9 @@
           <w:ilvl w:val="1"/>
           <w:numId w:val="14"/>
         </w:numPr>
+        <w:tabs>
+          <w:tab w:val="clear" w:pos="916"/>
+        </w:tabs>
         <w:spacing w:before="0" w:after="40"/>
         <w:jc w:val="left"/>
         <w:rPr>
@@ -1952,7 +1967,7 @@
         <w:widowControl/>
         <w:numPr>
           <w:ilvl w:val="1"/>
-          <w:numId w:val="8"/>
+          <w:numId w:val="24"/>
         </w:numPr>
         <w:tabs>
           <w:tab w:val="clear" w:pos="916"/>
@@ -1983,7 +1998,7 @@
         <w:widowControl/>
         <w:numPr>
           <w:ilvl w:val="1"/>
-          <w:numId w:val="8"/>
+          <w:numId w:val="24"/>
         </w:numPr>
         <w:tabs>
           <w:tab w:val="clear" w:pos="916"/>
@@ -2014,7 +2029,7 @@
         <w:widowControl/>
         <w:numPr>
           <w:ilvl w:val="1"/>
-          <w:numId w:val="8"/>
+          <w:numId w:val="24"/>
         </w:numPr>
         <w:tabs>
           <w:tab w:val="clear" w:pos="916"/>
@@ -2045,7 +2060,7 @@
         <w:widowControl/>
         <w:numPr>
           <w:ilvl w:val="1"/>
-          <w:numId w:val="8"/>
+          <w:numId w:val="24"/>
         </w:numPr>
         <w:tabs>
           <w:tab w:val="clear" w:pos="916"/>
@@ -2076,7 +2091,7 @@
         <w:widowControl/>
         <w:numPr>
           <w:ilvl w:val="1"/>
-          <w:numId w:val="8"/>
+          <w:numId w:val="24"/>
         </w:numPr>
         <w:tabs>
           <w:tab w:val="clear" w:pos="916"/>
@@ -2107,7 +2122,7 @@
         <w:widowControl/>
         <w:numPr>
           <w:ilvl w:val="1"/>
-          <w:numId w:val="8"/>
+          <w:numId w:val="24"/>
         </w:numPr>
         <w:tabs>
           <w:tab w:val="clear" w:pos="916"/>
@@ -2140,6 +2155,9 @@
           <w:ilvl w:val="1"/>
           <w:numId w:val="14"/>
         </w:numPr>
+        <w:tabs>
+          <w:tab w:val="clear" w:pos="916"/>
+        </w:tabs>
         <w:spacing w:before="0" w:after="40"/>
         <w:jc w:val="left"/>
         <w:rPr>
@@ -2210,6 +2228,9 @@
           <w:ilvl w:val="0"/>
           <w:numId w:val="9"/>
         </w:numPr>
+        <w:tabs>
+          <w:tab w:val="clear" w:pos="916"/>
+        </w:tabs>
         <w:spacing w:before="0" w:after="40"/>
         <w:jc w:val="left"/>
         <w:rPr>
@@ -2472,6 +2493,9 @@
           <w:ilvl w:val="0"/>
           <w:numId w:val="9"/>
         </w:numPr>
+        <w:tabs>
+          <w:tab w:val="clear" w:pos="916"/>
+        </w:tabs>
         <w:spacing w:before="0" w:after="40"/>
         <w:jc w:val="left"/>
         <w:rPr>
@@ -2500,6 +2524,9 @@
           <w:ilvl w:val="0"/>
           <w:numId w:val="9"/>
         </w:numPr>
+        <w:tabs>
+          <w:tab w:val="clear" w:pos="916"/>
+        </w:tabs>
         <w:spacing w:before="0" w:after="40"/>
         <w:jc w:val="left"/>
         <w:rPr>
@@ -2529,7 +2556,10 @@
           <w:ilvl w:val="0"/>
           <w:numId w:val="9"/>
         </w:numPr>
-        <w:spacing w:before="0" w:after="120"/>
+        <w:tabs>
+          <w:tab w:val="clear" w:pos="916"/>
+        </w:tabs>
+        <w:spacing w:before="0" w:after="40"/>
         <w:jc w:val="left"/>
         <w:rPr>
           <w:rFonts w:ascii="Arial" w:hAnsi="Arial" w:cs="Arial"/>
@@ -2557,6 +2587,9 @@
           <w:ilvl w:val="0"/>
           <w:numId w:val="13"/>
         </w:numPr>
+        <w:tabs>
+          <w:tab w:val="clear" w:pos="916"/>
+        </w:tabs>
         <w:spacing w:before="0" w:after="40"/>
         <w:jc w:val="left"/>
         <w:rPr>
@@ -2585,6 +2618,9 @@
           <w:ilvl w:val="0"/>
           <w:numId w:val="13"/>
         </w:numPr>
+        <w:tabs>
+          <w:tab w:val="clear" w:pos="916"/>
+        </w:tabs>
         <w:spacing w:before="0" w:after="40"/>
         <w:jc w:val="left"/>
         <w:rPr>
@@ -2613,6 +2649,9 @@
           <w:ilvl w:val="0"/>
           <w:numId w:val="13"/>
         </w:numPr>
+        <w:tabs>
+          <w:tab w:val="clear" w:pos="916"/>
+        </w:tabs>
         <w:spacing w:before="0" w:after="40"/>
         <w:jc w:val="left"/>
         <w:rPr>
@@ -2640,6 +2679,9 @@
           <w:ilvl w:val="0"/>
           <w:numId w:val="13"/>
         </w:numPr>
+        <w:tabs>
+          <w:tab w:val="clear" w:pos="916"/>
+        </w:tabs>
         <w:spacing w:before="0" w:after="40"/>
         <w:jc w:val="left"/>
         <w:rPr>
@@ -2667,6 +2709,9 @@
           <w:ilvl w:val="0"/>
           <w:numId w:val="9"/>
         </w:numPr>
+        <w:tabs>
+          <w:tab w:val="clear" w:pos="916"/>
+        </w:tabs>
         <w:spacing w:before="0" w:after="40"/>
         <w:jc w:val="left"/>
         <w:rPr>
@@ -2737,6 +2782,9 @@
           <w:ilvl w:val="1"/>
           <w:numId w:val="13"/>
         </w:numPr>
+        <w:tabs>
+          <w:tab w:val="clear" w:pos="916"/>
+        </w:tabs>
         <w:spacing w:before="0" w:after="40"/>
         <w:jc w:val="left"/>
         <w:rPr>
@@ -2765,6 +2813,9 @@
           <w:ilvl w:val="1"/>
           <w:numId w:val="13"/>
         </w:numPr>
+        <w:tabs>
+          <w:tab w:val="clear" w:pos="916"/>
+        </w:tabs>
         <w:spacing w:before="0" w:after="40"/>
         <w:jc w:val="left"/>
         <w:rPr>
@@ -2793,6 +2844,9 @@
           <w:ilvl w:val="1"/>
           <w:numId w:val="13"/>
         </w:numPr>
+        <w:tabs>
+          <w:tab w:val="clear" w:pos="916"/>
+        </w:tabs>
         <w:spacing w:before="0" w:after="40"/>
         <w:jc w:val="left"/>
         <w:rPr>
@@ -2821,6 +2875,9 @@
           <w:ilvl w:val="1"/>
           <w:numId w:val="13"/>
         </w:numPr>
+        <w:tabs>
+          <w:tab w:val="clear" w:pos="916"/>
+        </w:tabs>
         <w:spacing w:before="0" w:after="40"/>
         <w:jc w:val="left"/>
         <w:rPr>
@@ -2891,6 +2948,9 @@
           <w:ilvl w:val="0"/>
           <w:numId w:val="20"/>
         </w:numPr>
+        <w:tabs>
+          <w:tab w:val="clear" w:pos="916"/>
+        </w:tabs>
         <w:spacing w:before="0" w:after="40"/>
         <w:jc w:val="left"/>
         <w:rPr>
@@ -2920,7 +2980,10 @@
           <w:ilvl w:val="0"/>
           <w:numId w:val="20"/>
         </w:numPr>
-        <w:spacing w:before="0" w:after="120"/>
+        <w:tabs>
+          <w:tab w:val="clear" w:pos="916"/>
+        </w:tabs>
+        <w:spacing w:before="0" w:after="40"/>
         <w:jc w:val="left"/>
         <w:rPr>
           <w:rFonts w:ascii="Arial" w:hAnsi="Arial" w:cs="Arial"/>
@@ -2948,6 +3011,9 @@
           <w:ilvl w:val="0"/>
           <w:numId w:val="16"/>
         </w:numPr>
+        <w:tabs>
+          <w:tab w:val="clear" w:pos="916"/>
+        </w:tabs>
         <w:spacing w:before="0" w:after="40"/>
         <w:jc w:val="left"/>
         <w:rPr>
@@ -2975,6 +3041,9 @@
           <w:ilvl w:val="0"/>
           <w:numId w:val="16"/>
         </w:numPr>
+        <w:tabs>
+          <w:tab w:val="clear" w:pos="916"/>
+        </w:tabs>
         <w:spacing w:before="0" w:after="40"/>
         <w:jc w:val="left"/>
         <w:rPr>
@@ -3003,6 +3072,9 @@
           <w:ilvl w:val="0"/>
           <w:numId w:val="16"/>
         </w:numPr>
+        <w:tabs>
+          <w:tab w:val="clear" w:pos="916"/>
+        </w:tabs>
         <w:spacing w:before="0" w:after="40"/>
         <w:jc w:val="left"/>
         <w:rPr>
@@ -3030,6 +3102,9 @@
           <w:ilvl w:val="0"/>
           <w:numId w:val="16"/>
         </w:numPr>
+        <w:tabs>
+          <w:tab w:val="clear" w:pos="916"/>
+        </w:tabs>
         <w:spacing w:before="0" w:after="40"/>
         <w:jc w:val="left"/>
         <w:rPr>
@@ -3057,6 +3132,9 @@
           <w:ilvl w:val="0"/>
           <w:numId w:val="16"/>
         </w:numPr>
+        <w:tabs>
+          <w:tab w:val="clear" w:pos="916"/>
+        </w:tabs>
         <w:spacing w:before="0" w:after="40"/>
         <w:jc w:val="left"/>
         <w:rPr>
@@ -3085,6 +3163,9 @@
           <w:ilvl w:val="0"/>
           <w:numId w:val="16"/>
         </w:numPr>
+        <w:tabs>
+          <w:tab w:val="clear" w:pos="916"/>
+        </w:tabs>
         <w:spacing w:before="0" w:after="40"/>
         <w:jc w:val="left"/>
         <w:rPr>
@@ -3112,6 +3193,9 @@
           <w:ilvl w:val="0"/>
           <w:numId w:val="16"/>
         </w:numPr>
+        <w:tabs>
+          <w:tab w:val="clear" w:pos="916"/>
+        </w:tabs>
         <w:spacing w:before="0" w:after="40"/>
         <w:jc w:val="left"/>
         <w:rPr>
@@ -3140,6 +3224,9 @@
           <w:ilvl w:val="0"/>
           <w:numId w:val="16"/>
         </w:numPr>
+        <w:tabs>
+          <w:tab w:val="clear" w:pos="916"/>
+        </w:tabs>
         <w:spacing w:before="0" w:after="40"/>
         <w:jc w:val="left"/>
         <w:rPr>
@@ -3168,6 +3255,9 @@
           <w:ilvl w:val="0"/>
           <w:numId w:val="16"/>
         </w:numPr>
+        <w:tabs>
+          <w:tab w:val="clear" w:pos="916"/>
+        </w:tabs>
         <w:spacing w:before="0" w:after="40"/>
         <w:jc w:val="left"/>
         <w:rPr>
@@ -3196,6 +3286,9 @@
           <w:ilvl w:val="0"/>
           <w:numId w:val="16"/>
         </w:numPr>
+        <w:tabs>
+          <w:tab w:val="clear" w:pos="916"/>
+        </w:tabs>
         <w:spacing w:before="0" w:after="40"/>
         <w:jc w:val="left"/>
         <w:rPr>
@@ -3224,6 +3317,9 @@
           <w:ilvl w:val="0"/>
           <w:numId w:val="16"/>
         </w:numPr>
+        <w:tabs>
+          <w:tab w:val="clear" w:pos="916"/>
+        </w:tabs>
         <w:spacing w:before="0" w:after="40"/>
         <w:jc w:val="left"/>
         <w:rPr>
@@ -3252,6 +3348,9 @@
           <w:ilvl w:val="0"/>
           <w:numId w:val="16"/>
         </w:numPr>
+        <w:tabs>
+          <w:tab w:val="clear" w:pos="916"/>
+        </w:tabs>
         <w:spacing w:before="0" w:after="40"/>
         <w:jc w:val="left"/>
         <w:rPr>
@@ -3321,6 +3420,9 @@
           <w:ilvl w:val="0"/>
           <w:numId w:val="17"/>
         </w:numPr>
+        <w:tabs>
+          <w:tab w:val="clear" w:pos="916"/>
+        </w:tabs>
         <w:spacing w:before="0" w:after="40"/>
         <w:jc w:val="left"/>
         <w:rPr>
@@ -3349,6 +3451,9 @@
           <w:ilvl w:val="0"/>
           <w:numId w:val="17"/>
         </w:numPr>
+        <w:tabs>
+          <w:tab w:val="clear" w:pos="916"/>
+        </w:tabs>
         <w:spacing w:before="0" w:after="40"/>
         <w:jc w:val="left"/>
         <w:rPr>
@@ -3377,6 +3482,9 @@
           <w:ilvl w:val="0"/>
           <w:numId w:val="17"/>
         </w:numPr>
+        <w:tabs>
+          <w:tab w:val="clear" w:pos="916"/>
+        </w:tabs>
         <w:spacing w:before="0" w:after="40"/>
         <w:jc w:val="left"/>
         <w:rPr>
@@ -3447,6 +3555,9 @@
           <w:ilvl w:val="0"/>
           <w:numId w:val="10"/>
         </w:numPr>
+        <w:tabs>
+          <w:tab w:val="clear" w:pos="916"/>
+        </w:tabs>
         <w:spacing w:before="0" w:after="40"/>
         <w:jc w:val="left"/>
         <w:rPr>
@@ -3476,6 +3587,9 @@
           <w:ilvl w:val="0"/>
           <w:numId w:val="10"/>
         </w:numPr>
+        <w:tabs>
+          <w:tab w:val="clear" w:pos="916"/>
+        </w:tabs>
         <w:spacing w:before="0" w:after="40"/>
         <w:jc w:val="left"/>
         <w:rPr>
@@ -3658,6 +3772,9 @@
           <w:ilvl w:val="0"/>
           <w:numId w:val="10"/>
         </w:numPr>
+        <w:tabs>
+          <w:tab w:val="clear" w:pos="916"/>
+        </w:tabs>
         <w:spacing w:before="0" w:after="40"/>
         <w:jc w:val="left"/>
         <w:rPr>
@@ -3687,6 +3804,9 @@
           <w:ilvl w:val="0"/>
           <w:numId w:val="10"/>
         </w:numPr>
+        <w:tabs>
+          <w:tab w:val="clear" w:pos="916"/>
+        </w:tabs>
         <w:spacing w:before="0" w:after="40"/>
         <w:jc w:val="left"/>
         <w:rPr>
@@ -3869,7 +3989,7 @@
           <w:ilvl w:val="0"/>
           <w:numId w:val="2"/>
         </w:numPr>
-        <w:spacing w:before="0" w:after="120"/>
+        <w:spacing w:before="0" w:after="40"/>
         <w:jc w:val="left"/>
         <w:rPr>
           <w:rFonts w:ascii="Arial" w:hAnsi="Arial" w:cs="Arial"/>
@@ -4051,7 +4171,7 @@
           <w:ilvl w:val="0"/>
           <w:numId w:val="2"/>
         </w:numPr>
-        <w:spacing w:before="0" w:after="120"/>
+        <w:spacing w:before="0" w:after="40"/>
         <w:jc w:val="left"/>
         <w:rPr>
           <w:rFonts w:ascii="Arial" w:hAnsi="Arial" w:cs="Arial"/>
@@ -4142,7 +4262,7 @@
           <w:ilvl w:val="0"/>
           <w:numId w:val="2"/>
         </w:numPr>
-        <w:spacing w:before="0" w:after="120"/>
+        <w:spacing w:before="0" w:after="40"/>
         <w:jc w:val="left"/>
         <w:rPr>
           <w:rFonts w:ascii="Arial" w:hAnsi="Arial" w:cs="Arial"/>
@@ -4204,7 +4324,7 @@
         <w:tabs>
           <w:tab w:val="clear" w:pos="916"/>
         </w:tabs>
-        <w:spacing w:before="0" w:after="40"/>
+        <w:spacing w:before="0" w:after="120"/>
         <w:jc w:val="left"/>
         <w:rPr>
           <w:rFonts w:ascii="Arial" w:hAnsi="Arial" w:cs="Arial"/>
@@ -5181,7 +5301,7 @@
         <w:pStyle w:val="Normal"/>
         <w:keepNext w:val="false"/>
         <w:widowControl/>
-        <w:spacing w:before="0" w:after="480"/>
+        <w:spacing w:before="0" w:after="120"/>
         <w:ind w:hanging="0" w:left="0" w:right="0"/>
         <w:jc w:val="center"/>
         <w:rPr>
@@ -6485,7 +6605,7 @@
         <w:ind w:left="1080" w:hanging="360"/>
       </w:pPr>
       <w:rPr>
-        <w:rFonts w:ascii="Times New Roman" w:hAnsi="Times New Roman" w:cs="Times New Roman" w:hint="default"/>
+        <w:rFonts w:ascii="Arial" w:hAnsi="Arial" w:cs="Arial" w:hint="default"/>
       </w:rPr>
     </w:lvl>
     <w:lvl w:ilvl="1">
@@ -6593,9 +6713,9 @@
       <w:lvlJc w:val="left"/>
       <w:pPr>
         <w:tabs>
-          <w:tab w:val="num" w:pos="1080"/>
-        </w:tabs>
-        <w:ind w:left="1080" w:hanging="360"/>
+          <w:tab w:val="num" w:pos="1800"/>
+        </w:tabs>
+        <w:ind w:left="1800" w:hanging="360"/>
       </w:pPr>
       <w:rPr>
         <w:b/>
@@ -6711,7 +6831,7 @@
         <w:ind w:left="1080" w:hanging="360"/>
       </w:pPr>
       <w:rPr>
-        <w:rFonts w:ascii="Times New Roman" w:hAnsi="Times New Roman" w:cs="Times New Roman" w:hint="default"/>
+        <w:rFonts w:ascii="Arial" w:hAnsi="Arial" w:cs="Arial" w:hint="default"/>
       </w:rPr>
     </w:lvl>
     <w:lvl w:ilvl="1">
@@ -7044,9 +7164,9 @@
       <w:lvlJc w:val="left"/>
       <w:pPr>
         <w:tabs>
-          <w:tab w:val="num" w:pos="1080"/>
-        </w:tabs>
-        <w:ind w:left="1080" w:hanging="360"/>
+          <w:tab w:val="num" w:pos="1800"/>
+        </w:tabs>
+        <w:ind w:left="1800" w:hanging="360"/>
       </w:pPr>
       <w:rPr>
         <w:rFonts w:ascii="Arial" w:hAnsi="Arial" w:cs="Arial" w:hint="default"/>
@@ -7186,9 +7306,9 @@
       <w:lvlJc w:val="left"/>
       <w:pPr>
         <w:tabs>
-          <w:tab w:val="num" w:pos="720"/>
-        </w:tabs>
-        <w:ind w:left="720" w:hanging="360"/>
+          <w:tab w:val="num" w:pos="1080"/>
+        </w:tabs>
+        <w:ind w:left="1080" w:hanging="360"/>
       </w:pPr>
       <w:rPr>
         <w:b/>
@@ -7299,9 +7419,9 @@
       <w:lvlJc w:val="left"/>
       <w:pPr>
         <w:tabs>
-          <w:tab w:val="num" w:pos="720"/>
-        </w:tabs>
-        <w:ind w:left="720" w:hanging="360"/>
+          <w:tab w:val="num" w:pos="1080"/>
+        </w:tabs>
+        <w:ind w:left="1080" w:hanging="360"/>
       </w:pPr>
       <w:rPr>
         <w:b/>
@@ -7412,9 +7532,9 @@
       <w:lvlJc w:val="left"/>
       <w:pPr>
         <w:tabs>
-          <w:tab w:val="num" w:pos="1080"/>
-        </w:tabs>
-        <w:ind w:left="1080" w:hanging="360"/>
+          <w:tab w:val="num" w:pos="1800"/>
+        </w:tabs>
+        <w:ind w:left="1800" w:hanging="360"/>
       </w:pPr>
       <w:rPr>
         <w:rFonts w:ascii="Arial" w:hAnsi="Arial" w:eastAsia="Times New Roman" w:cs="Arial"/>
@@ -7531,7 +7651,7 @@
         <w:ind w:left="1080" w:hanging="360"/>
       </w:pPr>
       <w:rPr>
-        <w:rFonts w:ascii="Times New Roman" w:hAnsi="Times New Roman" w:cs="Times New Roman" w:hint="default"/>
+        <w:rFonts w:ascii="Arial" w:hAnsi="Arial" w:cs="Arial" w:hint="default"/>
       </w:rPr>
     </w:lvl>
     <w:lvl w:ilvl="1">
@@ -7639,9 +7759,9 @@
       <w:lvlJc w:val="left"/>
       <w:pPr>
         <w:tabs>
-          <w:tab w:val="num" w:pos="720"/>
-        </w:tabs>
-        <w:ind w:left="720" w:hanging="360"/>
+          <w:tab w:val="num" w:pos="1800"/>
+        </w:tabs>
+        <w:ind w:left="1800" w:hanging="360"/>
       </w:pPr>
       <w:rPr>
         <w:rFonts w:ascii="Arial" w:hAnsi="Arial" w:cs="Arial" w:hint="default"/>
@@ -7654,9 +7774,9 @@
       <w:lvlJc w:val="left"/>
       <w:pPr>
         <w:tabs>
-          <w:tab w:val="num" w:pos="720"/>
-        </w:tabs>
-        <w:ind w:left="720" w:hanging="360"/>
+          <w:tab w:val="num" w:pos="1080"/>
+        </w:tabs>
+        <w:ind w:left="1080" w:hanging="360"/>
       </w:pPr>
       <w:rPr>
         <w:b/>
@@ -7776,9 +7896,9 @@
       <w:lvlJc w:val="left"/>
       <w:pPr>
         <w:tabs>
-          <w:tab w:val="num" w:pos="1080"/>
-        </w:tabs>
-        <w:ind w:left="1080" w:hanging="360"/>
+          <w:tab w:val="num" w:pos="1800"/>
+        </w:tabs>
+        <w:ind w:left="1800" w:hanging="360"/>
       </w:pPr>
       <w:rPr>
         <w:b/>
@@ -7791,9 +7911,9 @@
       <w:lvlJc w:val="left"/>
       <w:pPr>
         <w:tabs>
-          <w:tab w:val="num" w:pos="720"/>
-        </w:tabs>
-        <w:ind w:left="720" w:hanging="360"/>
+          <w:tab w:val="num" w:pos="1080"/>
+        </w:tabs>
+        <w:ind w:left="1080" w:hanging="360"/>
       </w:pPr>
       <w:rPr>
         <w:b/>
@@ -8021,9 +8141,9 @@
       <w:lvlJc w:val="left"/>
       <w:pPr>
         <w:tabs>
-          <w:tab w:val="num" w:pos="720"/>
-        </w:tabs>
-        <w:ind w:left="720" w:hanging="360"/>
+          <w:tab w:val="num" w:pos="1800"/>
+        </w:tabs>
+        <w:ind w:left="1800" w:hanging="360"/>
       </w:pPr>
       <w:rPr>
         <w:rFonts w:ascii="Arial" w:hAnsi="Arial" w:cs="Arial" w:hint="default"/>
@@ -8134,9 +8254,9 @@
       <w:lvlJc w:val="left"/>
       <w:pPr>
         <w:tabs>
-          <w:tab w:val="num" w:pos="720"/>
-        </w:tabs>
-        <w:ind w:left="720" w:hanging="360"/>
+          <w:tab w:val="num" w:pos="1080"/>
+        </w:tabs>
+        <w:ind w:left="1080" w:hanging="360"/>
       </w:pPr>
       <w:rPr>
         <w:b/>
@@ -8247,9 +8367,9 @@
       <w:lvlJc w:val="left"/>
       <w:pPr>
         <w:tabs>
-          <w:tab w:val="num" w:pos="1080"/>
-        </w:tabs>
-        <w:ind w:left="1080" w:hanging="360"/>
+          <w:tab w:val="num" w:pos="1800"/>
+        </w:tabs>
+        <w:ind w:left="1800" w:hanging="360"/>
       </w:pPr>
       <w:rPr>
         <w:b/>
@@ -8360,9 +8480,9 @@
       <w:lvlJc w:val="left"/>
       <w:pPr>
         <w:tabs>
-          <w:tab w:val="num" w:pos="720"/>
-        </w:tabs>
-        <w:ind w:left="720" w:hanging="360"/>
+          <w:tab w:val="num" w:pos="1080"/>
+        </w:tabs>
+        <w:ind w:left="1080" w:hanging="360"/>
       </w:pPr>
       <w:rPr>
         <w:b/>
@@ -8473,9 +8593,9 @@
       <w:lvlJc w:val="left"/>
       <w:pPr>
         <w:tabs>
-          <w:tab w:val="num" w:pos="720"/>
-        </w:tabs>
-        <w:ind w:left="720" w:hanging="360"/>
+          <w:tab w:val="num" w:pos="1080"/>
+        </w:tabs>
+        <w:ind w:left="1080" w:hanging="360"/>
       </w:pPr>
       <w:rPr>
         <w:b/>
@@ -8618,9 +8738,9 @@
       <w:lvlJc w:val="left"/>
       <w:pPr>
         <w:tabs>
-          <w:tab w:val="num" w:pos="720"/>
-        </w:tabs>
-        <w:ind w:left="720" w:hanging="360"/>
+          <w:tab w:val="num" w:pos="1080"/>
+        </w:tabs>
+        <w:ind w:left="1080" w:hanging="360"/>
       </w:pPr>
       <w:rPr>
         <w:b/>
@@ -8823,6 +8943,290 @@
     </w:lvl>
   </w:abstractNum>
   <w:abstractNum w:abstractNumId="23">
+    <w:lvl w:ilvl="0">
+      <w:start w:val="2"/>
+      <w:numFmt w:val="bullet"/>
+      <w:lvlText w:val="-"/>
+      <w:lvlJc w:val="left"/>
+      <w:pPr>
+        <w:tabs>
+          <w:tab w:val="num" w:pos="1800"/>
+        </w:tabs>
+        <w:ind w:left="1800" w:hanging="360"/>
+      </w:pPr>
+      <w:rPr>
+        <w:rFonts w:ascii="Arial" w:hAnsi="Arial" w:cs="Arial" w:hint="default"/>
+      </w:rPr>
+    </w:lvl>
+    <w:lvl w:ilvl="1">
+      <w:start w:val="1"/>
+      <w:numFmt w:val="lowerLetter"/>
+      <w:lvlText w:val="%2)"/>
+      <w:lvlJc w:val="left"/>
+      <w:pPr>
+        <w:tabs>
+          <w:tab w:val="num" w:pos="1080"/>
+        </w:tabs>
+        <w:ind w:left="1080" w:hanging="360"/>
+      </w:pPr>
+      <w:rPr>
+        <w:b/>
+        <w:bCs/>
+      </w:rPr>
+    </w:lvl>
+    <w:lvl w:ilvl="2">
+      <w:start w:val="65535"/>
+      <w:numFmt w:val="bullet"/>
+      <w:lvlText w:val="-"/>
+      <w:lvlJc w:val="left"/>
+      <w:pPr>
+        <w:tabs>
+          <w:tab w:val="num" w:pos="0"/>
+        </w:tabs>
+        <w:ind w:left="1080" w:hanging="360"/>
+      </w:pPr>
+      <w:rPr>
+        <w:rFonts w:ascii="Times New Roman" w:hAnsi="Times New Roman" w:cs="Times New Roman" w:hint="default"/>
+        <w:b/>
+        <w:i w:val="false"/>
+        <w:sz w:val="18"/>
+        <w:szCs w:val="18"/>
+      </w:rPr>
+    </w:lvl>
+    <w:lvl w:ilvl="3">
+      <w:start w:val="1"/>
+      <w:numFmt w:val="bullet"/>
+      <w:lvlText w:val=""/>
+      <w:lvlJc w:val="left"/>
+      <w:pPr>
+        <w:tabs>
+          <w:tab w:val="num" w:pos="3240"/>
+        </w:tabs>
+        <w:ind w:left="3240" w:hanging="360"/>
+      </w:pPr>
+      <w:rPr>
+        <w:rFonts w:ascii="Symbol" w:hAnsi="Symbol" w:cs="Symbol" w:hint="default"/>
+      </w:rPr>
+    </w:lvl>
+    <w:lvl w:ilvl="4">
+      <w:start w:val="1"/>
+      <w:numFmt w:val="bullet"/>
+      <w:lvlText w:val="o"/>
+      <w:lvlJc w:val="left"/>
+      <w:pPr>
+        <w:tabs>
+          <w:tab w:val="num" w:pos="3960"/>
+        </w:tabs>
+        <w:ind w:left="3960" w:hanging="360"/>
+      </w:pPr>
+      <w:rPr>
+        <w:rFonts w:ascii="Courier New" w:hAnsi="Courier New" w:cs="Courier New" w:hint="default"/>
+      </w:rPr>
+    </w:lvl>
+    <w:lvl w:ilvl="5">
+      <w:start w:val="1"/>
+      <w:numFmt w:val="bullet"/>
+      <w:lvlText w:val=""/>
+      <w:lvlJc w:val="left"/>
+      <w:pPr>
+        <w:tabs>
+          <w:tab w:val="num" w:pos="4680"/>
+        </w:tabs>
+        <w:ind w:left="4680" w:hanging="360"/>
+      </w:pPr>
+      <w:rPr>
+        <w:rFonts w:ascii="Wingdings" w:hAnsi="Wingdings" w:cs="Wingdings" w:hint="default"/>
+      </w:rPr>
+    </w:lvl>
+    <w:lvl w:ilvl="6">
+      <w:start w:val="1"/>
+      <w:numFmt w:val="bullet"/>
+      <w:lvlText w:val=""/>
+      <w:lvlJc w:val="left"/>
+      <w:pPr>
+        <w:tabs>
+          <w:tab w:val="num" w:pos="5400"/>
+        </w:tabs>
+        <w:ind w:left="5400" w:hanging="360"/>
+      </w:pPr>
+      <w:rPr>
+        <w:rFonts w:ascii="Symbol" w:hAnsi="Symbol" w:cs="Symbol" w:hint="default"/>
+      </w:rPr>
+    </w:lvl>
+    <w:lvl w:ilvl="7">
+      <w:start w:val="1"/>
+      <w:numFmt w:val="bullet"/>
+      <w:lvlText w:val="o"/>
+      <w:lvlJc w:val="left"/>
+      <w:pPr>
+        <w:tabs>
+          <w:tab w:val="num" w:pos="6120"/>
+        </w:tabs>
+        <w:ind w:left="6120" w:hanging="360"/>
+      </w:pPr>
+      <w:rPr>
+        <w:rFonts w:ascii="Courier New" w:hAnsi="Courier New" w:cs="Courier New" w:hint="default"/>
+      </w:rPr>
+    </w:lvl>
+    <w:lvl w:ilvl="8">
+      <w:start w:val="1"/>
+      <w:numFmt w:val="bullet"/>
+      <w:lvlText w:val=""/>
+      <w:lvlJc w:val="left"/>
+      <w:pPr>
+        <w:tabs>
+          <w:tab w:val="num" w:pos="6840"/>
+        </w:tabs>
+        <w:ind w:left="6840" w:hanging="360"/>
+      </w:pPr>
+      <w:rPr>
+        <w:rFonts w:ascii="Wingdings" w:hAnsi="Wingdings" w:cs="Wingdings" w:hint="default"/>
+      </w:rPr>
+    </w:lvl>
+  </w:abstractNum>
+  <w:abstractNum w:abstractNumId="24">
+    <w:lvl w:ilvl="0">
+      <w:start w:val="2"/>
+      <w:numFmt w:val="bullet"/>
+      <w:lvlText w:val="-"/>
+      <w:lvlJc w:val="left"/>
+      <w:pPr>
+        <w:tabs>
+          <w:tab w:val="num" w:pos="1800"/>
+        </w:tabs>
+        <w:ind w:left="1800" w:hanging="360"/>
+      </w:pPr>
+      <w:rPr>
+        <w:rFonts w:ascii="Arial" w:hAnsi="Arial" w:cs="Arial" w:hint="default"/>
+      </w:rPr>
+    </w:lvl>
+    <w:lvl w:ilvl="1">
+      <w:start w:val="1"/>
+      <w:numFmt w:val="lowerLetter"/>
+      <w:lvlText w:val="%2)"/>
+      <w:lvlJc w:val="left"/>
+      <w:pPr>
+        <w:tabs>
+          <w:tab w:val="num" w:pos="1800"/>
+        </w:tabs>
+        <w:ind w:left="1800" w:hanging="360"/>
+      </w:pPr>
+      <w:rPr>
+        <w:b/>
+        <w:bCs/>
+      </w:rPr>
+    </w:lvl>
+    <w:lvl w:ilvl="2">
+      <w:start w:val="65535"/>
+      <w:numFmt w:val="bullet"/>
+      <w:lvlText w:val="-"/>
+      <w:lvlJc w:val="left"/>
+      <w:pPr>
+        <w:tabs>
+          <w:tab w:val="num" w:pos="0"/>
+        </w:tabs>
+        <w:ind w:left="1080" w:hanging="360"/>
+      </w:pPr>
+      <w:rPr>
+        <w:rFonts w:ascii="Times New Roman" w:hAnsi="Times New Roman" w:cs="Times New Roman" w:hint="default"/>
+        <w:b/>
+        <w:i w:val="false"/>
+        <w:sz w:val="18"/>
+        <w:szCs w:val="18"/>
+      </w:rPr>
+    </w:lvl>
+    <w:lvl w:ilvl="3">
+      <w:start w:val="1"/>
+      <w:numFmt w:val="bullet"/>
+      <w:lvlText w:val=""/>
+      <w:lvlJc w:val="left"/>
+      <w:pPr>
+        <w:tabs>
+          <w:tab w:val="num" w:pos="3240"/>
+        </w:tabs>
+        <w:ind w:left="3240" w:hanging="360"/>
+      </w:pPr>
+      <w:rPr>
+        <w:rFonts w:ascii="Symbol" w:hAnsi="Symbol" w:cs="Symbol" w:hint="default"/>
+      </w:rPr>
+    </w:lvl>
+    <w:lvl w:ilvl="4">
+      <w:start w:val="1"/>
+      <w:numFmt w:val="bullet"/>
+      <w:lvlText w:val="o"/>
+      <w:lvlJc w:val="left"/>
+      <w:pPr>
+        <w:tabs>
+          <w:tab w:val="num" w:pos="3960"/>
+        </w:tabs>
+        <w:ind w:left="3960" w:hanging="360"/>
+      </w:pPr>
+      <w:rPr>
+        <w:rFonts w:ascii="Courier New" w:hAnsi="Courier New" w:cs="Courier New" w:hint="default"/>
+      </w:rPr>
+    </w:lvl>
+    <w:lvl w:ilvl="5">
+      <w:start w:val="1"/>
+      <w:numFmt w:val="bullet"/>
+      <w:lvlText w:val=""/>
+      <w:lvlJc w:val="left"/>
+      <w:pPr>
+        <w:tabs>
+          <w:tab w:val="num" w:pos="4680"/>
+        </w:tabs>
+        <w:ind w:left="4680" w:hanging="360"/>
+      </w:pPr>
+      <w:rPr>
+        <w:rFonts w:ascii="Wingdings" w:hAnsi="Wingdings" w:cs="Wingdings" w:hint="default"/>
+      </w:rPr>
+    </w:lvl>
+    <w:lvl w:ilvl="6">
+      <w:start w:val="1"/>
+      <w:numFmt w:val="bullet"/>
+      <w:lvlText w:val=""/>
+      <w:lvlJc w:val="left"/>
+      <w:pPr>
+        <w:tabs>
+          <w:tab w:val="num" w:pos="5400"/>
+        </w:tabs>
+        <w:ind w:left="5400" w:hanging="360"/>
+      </w:pPr>
+      <w:rPr>
+        <w:rFonts w:ascii="Symbol" w:hAnsi="Symbol" w:cs="Symbol" w:hint="default"/>
+      </w:rPr>
+    </w:lvl>
+    <w:lvl w:ilvl="7">
+      <w:start w:val="1"/>
+      <w:numFmt w:val="bullet"/>
+      <w:lvlText w:val="o"/>
+      <w:lvlJc w:val="left"/>
+      <w:pPr>
+        <w:tabs>
+          <w:tab w:val="num" w:pos="6120"/>
+        </w:tabs>
+        <w:ind w:left="6120" w:hanging="360"/>
+      </w:pPr>
+      <w:rPr>
+        <w:rFonts w:ascii="Courier New" w:hAnsi="Courier New" w:cs="Courier New" w:hint="default"/>
+      </w:rPr>
+    </w:lvl>
+    <w:lvl w:ilvl="8">
+      <w:start w:val="1"/>
+      <w:numFmt w:val="bullet"/>
+      <w:lvlText w:val=""/>
+      <w:lvlJc w:val="left"/>
+      <w:pPr>
+        <w:tabs>
+          <w:tab w:val="num" w:pos="6840"/>
+        </w:tabs>
+        <w:ind w:left="6840" w:hanging="360"/>
+      </w:pPr>
+      <w:rPr>
+        <w:rFonts w:ascii="Wingdings" w:hAnsi="Wingdings" w:cs="Wingdings" w:hint="default"/>
+      </w:rPr>
+    </w:lvl>
+  </w:abstractNum>
+  <w:abstractNum w:abstractNumId="25">
     <w:lvl w:ilvl="0">
       <w:start w:val="1"/>
       <w:numFmt w:val="none"/>
@@ -9009,6 +9413,12 @@
   </w:num>
   <w:num w:numId="23">
     <w:abstractNumId w:val="23"/>
+  </w:num>
+  <w:num w:numId="24">
+    <w:abstractNumId w:val="24"/>
+  </w:num>
+  <w:num w:numId="25">
+    <w:abstractNumId w:val="25"/>
   </w:num>
 </w:numbering>
 </file>

</xml_diff>